<commit_message>
Initial commit - Streamlit ML Risk Prediction App
</commit_message>
<xml_diff>
--- a/APL_Logistics_Research_Paper.docx
+++ b/APL_Logistics_Research_Paper.docx
@@ -5670,8 +5670,8 @@
       </w:tblPr>
       <w:tblGrid>
         <w:gridCol w:w="1080"/>
-        <w:gridCol w:w="794"/>
-        <w:gridCol w:w="736"/>
+        <w:gridCol w:w="793"/>
+        <w:gridCol w:w="737"/>
         <w:gridCol w:w="675"/>
         <w:gridCol w:w="1020"/>
       </w:tblGrid>
@@ -5714,7 +5714,7 @@
         </w:tc>
         <w:tc>
           <w:tcPr>
-            <w:tcW w:w="794" w:type="dxa"/>
+            <w:tcW w:w="793" w:type="dxa"/>
             <w:tcBorders>
               <w:top w:val="single" w:sz="6" w:space="0" w:color="1A3560"/>
               <w:start w:val="single" w:sz="6" w:space="0" w:color="1A3560"/>
@@ -5747,7 +5747,7 @@
         </w:tc>
         <w:tc>
           <w:tcPr>
-            <w:tcW w:w="736" w:type="dxa"/>
+            <w:tcW w:w="737" w:type="dxa"/>
             <w:tcBorders>
               <w:top w:val="single" w:sz="6" w:space="0" w:color="1A3560"/>
               <w:start w:val="single" w:sz="6" w:space="0" w:color="1A3560"/>
@@ -5884,7 +5884,7 @@
         </w:tc>
         <w:tc>
           <w:tcPr>
-            <w:tcW w:w="794" w:type="dxa"/>
+            <w:tcW w:w="793" w:type="dxa"/>
             <w:tcBorders>
               <w:top w:val="single" w:sz="4" w:space="0" w:color="C5D8EC"/>
               <w:start w:val="single" w:sz="4" w:space="0" w:color="C5D8EC"/>
@@ -5919,7 +5919,7 @@
         </w:tc>
         <w:tc>
           <w:tcPr>
-            <w:tcW w:w="736" w:type="dxa"/>
+            <w:tcW w:w="737" w:type="dxa"/>
             <w:tcBorders>
               <w:top w:val="single" w:sz="4" w:space="0" w:color="C5D8EC"/>
               <w:start w:val="single" w:sz="4" w:space="0" w:color="C5D8EC"/>
@@ -6061,7 +6061,7 @@
         </w:tc>
         <w:tc>
           <w:tcPr>
-            <w:tcW w:w="794" w:type="dxa"/>
+            <w:tcW w:w="793" w:type="dxa"/>
             <w:tcBorders>
               <w:top w:val="single" w:sz="4" w:space="0" w:color="C5D8EC"/>
               <w:start w:val="single" w:sz="4" w:space="0" w:color="C5D8EC"/>
@@ -6095,7 +6095,7 @@
         </w:tc>
         <w:tc>
           <w:tcPr>
-            <w:tcW w:w="736" w:type="dxa"/>
+            <w:tcW w:w="737" w:type="dxa"/>
             <w:tcBorders>
               <w:top w:val="single" w:sz="4" w:space="0" w:color="C5D8EC"/>
               <w:start w:val="single" w:sz="4" w:space="0" w:color="C5D8EC"/>
@@ -6235,7 +6235,7 @@
         </w:tc>
         <w:tc>
           <w:tcPr>
-            <w:tcW w:w="794" w:type="dxa"/>
+            <w:tcW w:w="793" w:type="dxa"/>
             <w:tcBorders>
               <w:top w:val="single" w:sz="4" w:space="0" w:color="C5D8EC"/>
               <w:start w:val="single" w:sz="4" w:space="0" w:color="C5D8EC"/>
@@ -6270,7 +6270,7 @@
         </w:tc>
         <w:tc>
           <w:tcPr>
-            <w:tcW w:w="736" w:type="dxa"/>
+            <w:tcW w:w="737" w:type="dxa"/>
             <w:tcBorders>
               <w:top w:val="single" w:sz="4" w:space="0" w:color="C5D8EC"/>
               <w:start w:val="single" w:sz="4" w:space="0" w:color="C5D8EC"/>
@@ -6412,7 +6412,7 @@
         </w:tc>
         <w:tc>
           <w:tcPr>
-            <w:tcW w:w="794" w:type="dxa"/>
+            <w:tcW w:w="793" w:type="dxa"/>
             <w:tcBorders>
               <w:top w:val="single" w:sz="4" w:space="0" w:color="C5D8EC"/>
               <w:start w:val="single" w:sz="4" w:space="0" w:color="C5D8EC"/>
@@ -6446,7 +6446,7 @@
         </w:tc>
         <w:tc>
           <w:tcPr>
-            <w:tcW w:w="736" w:type="dxa"/>
+            <w:tcW w:w="737" w:type="dxa"/>
             <w:tcBorders>
               <w:top w:val="single" w:sz="4" w:space="0" w:color="C5D8EC"/>
               <w:start w:val="single" w:sz="4" w:space="0" w:color="C5D8EC"/>
@@ -6586,7 +6586,7 @@
         </w:tc>
         <w:tc>
           <w:tcPr>
-            <w:tcW w:w="794" w:type="dxa"/>
+            <w:tcW w:w="793" w:type="dxa"/>
             <w:tcBorders>
               <w:top w:val="single" w:sz="4" w:space="0" w:color="C5D8EC"/>
               <w:start w:val="single" w:sz="4" w:space="0" w:color="C5D8EC"/>
@@ -6621,7 +6621,7 @@
         </w:tc>
         <w:tc>
           <w:tcPr>
-            <w:tcW w:w="736" w:type="dxa"/>
+            <w:tcW w:w="737" w:type="dxa"/>
             <w:tcBorders>
               <w:top w:val="single" w:sz="4" w:space="0" w:color="C5D8EC"/>
               <w:start w:val="single" w:sz="4" w:space="0" w:color="C5D8EC"/>
@@ -6763,7 +6763,7 @@
         </w:tc>
         <w:tc>
           <w:tcPr>
-            <w:tcW w:w="794" w:type="dxa"/>
+            <w:tcW w:w="793" w:type="dxa"/>
             <w:tcBorders>
               <w:top w:val="single" w:sz="4" w:space="0" w:color="C5D8EC"/>
               <w:start w:val="single" w:sz="4" w:space="0" w:color="C5D8EC"/>
@@ -6797,7 +6797,7 @@
         </w:tc>
         <w:tc>
           <w:tcPr>
-            <w:tcW w:w="736" w:type="dxa"/>
+            <w:tcW w:w="737" w:type="dxa"/>
             <w:tcBorders>
               <w:top w:val="single" w:sz="4" w:space="0" w:color="C5D8EC"/>
               <w:start w:val="single" w:sz="4" w:space="0" w:color="C5D8EC"/>
@@ -7287,8 +7287,8 @@
         </w:tblCellMar>
       </w:tblPr>
       <w:tblGrid>
-        <w:gridCol w:w="2264"/>
-        <w:gridCol w:w="2041"/>
+        <w:gridCol w:w="2263"/>
+        <w:gridCol w:w="2042"/>
       </w:tblGrid>
       <w:tr>
         <w:trPr>
@@ -7296,7 +7296,7 @@
         </w:trPr>
         <w:tc>
           <w:tcPr>
-            <w:tcW w:w="2264" w:type="dxa"/>
+            <w:tcW w:w="2263" w:type="dxa"/>
             <w:tcBorders>
               <w:top w:val="single" w:sz="6" w:space="0" w:color="1A3560"/>
               <w:start w:val="single" w:sz="6" w:space="0" w:color="1A3560"/>
@@ -7328,7 +7328,7 @@
         </w:tc>
         <w:tc>
           <w:tcPr>
-            <w:tcW w:w="2041" w:type="dxa"/>
+            <w:tcW w:w="2042" w:type="dxa"/>
             <w:tcBorders>
               <w:top w:val="single" w:sz="6" w:space="0" w:color="1A3560"/>
               <w:start w:val="single" w:sz="6" w:space="0" w:color="1A3560"/>
@@ -7363,7 +7363,7 @@
         <w:trPr/>
         <w:tc>
           <w:tcPr>
-            <w:tcW w:w="2264" w:type="dxa"/>
+            <w:tcW w:w="2263" w:type="dxa"/>
             <w:tcBorders>
               <w:top w:val="single" w:sz="4" w:space="0" w:color="C5D8EC"/>
               <w:start w:val="single" w:sz="4" w:space="0" w:color="C5D8EC"/>
@@ -7397,7 +7397,7 @@
         </w:tc>
         <w:tc>
           <w:tcPr>
-            <w:tcW w:w="2041" w:type="dxa"/>
+            <w:tcW w:w="2042" w:type="dxa"/>
             <w:tcBorders>
               <w:top w:val="single" w:sz="4" w:space="0" w:color="C5D8EC"/>
               <w:start w:val="single" w:sz="4" w:space="0" w:color="C5D8EC"/>
@@ -7434,7 +7434,7 @@
         <w:trPr/>
         <w:tc>
           <w:tcPr>
-            <w:tcW w:w="2264" w:type="dxa"/>
+            <w:tcW w:w="2263" w:type="dxa"/>
             <w:tcBorders>
               <w:top w:val="single" w:sz="4" w:space="0" w:color="C5D8EC"/>
               <w:start w:val="single" w:sz="4" w:space="0" w:color="C5D8EC"/>
@@ -7467,7 +7467,7 @@
         </w:tc>
         <w:tc>
           <w:tcPr>
-            <w:tcW w:w="2041" w:type="dxa"/>
+            <w:tcW w:w="2042" w:type="dxa"/>
             <w:tcBorders>
               <w:top w:val="single" w:sz="4" w:space="0" w:color="C5D8EC"/>
               <w:start w:val="single" w:sz="4" w:space="0" w:color="C5D8EC"/>
@@ -7503,7 +7503,7 @@
         <w:trPr/>
         <w:tc>
           <w:tcPr>
-            <w:tcW w:w="2264" w:type="dxa"/>
+            <w:tcW w:w="2263" w:type="dxa"/>
             <w:tcBorders>
               <w:top w:val="single" w:sz="4" w:space="0" w:color="C5D8EC"/>
               <w:start w:val="single" w:sz="4" w:space="0" w:color="C5D8EC"/>
@@ -7537,7 +7537,7 @@
         </w:tc>
         <w:tc>
           <w:tcPr>
-            <w:tcW w:w="2041" w:type="dxa"/>
+            <w:tcW w:w="2042" w:type="dxa"/>
             <w:tcBorders>
               <w:top w:val="single" w:sz="4" w:space="0" w:color="C5D8EC"/>
               <w:start w:val="single" w:sz="4" w:space="0" w:color="C5D8EC"/>
@@ -7574,7 +7574,7 @@
         <w:trPr/>
         <w:tc>
           <w:tcPr>
-            <w:tcW w:w="2264" w:type="dxa"/>
+            <w:tcW w:w="2263" w:type="dxa"/>
             <w:tcBorders>
               <w:top w:val="single" w:sz="4" w:space="0" w:color="C5D8EC"/>
               <w:start w:val="single" w:sz="4" w:space="0" w:color="C5D8EC"/>
@@ -7607,7 +7607,7 @@
         </w:tc>
         <w:tc>
           <w:tcPr>
-            <w:tcW w:w="2041" w:type="dxa"/>
+            <w:tcW w:w="2042" w:type="dxa"/>
             <w:tcBorders>
               <w:top w:val="single" w:sz="4" w:space="0" w:color="C5D8EC"/>
               <w:start w:val="single" w:sz="4" w:space="0" w:color="C5D8EC"/>
@@ -7643,7 +7643,7 @@
         <w:trPr/>
         <w:tc>
           <w:tcPr>
-            <w:tcW w:w="2264" w:type="dxa"/>
+            <w:tcW w:w="2263" w:type="dxa"/>
             <w:tcBorders>
               <w:top w:val="single" w:sz="4" w:space="0" w:color="C5D8EC"/>
               <w:start w:val="single" w:sz="4" w:space="0" w:color="C5D8EC"/>
@@ -7677,7 +7677,7 @@
         </w:tc>
         <w:tc>
           <w:tcPr>
-            <w:tcW w:w="2041" w:type="dxa"/>
+            <w:tcW w:w="2042" w:type="dxa"/>
             <w:tcBorders>
               <w:top w:val="single" w:sz="4" w:space="0" w:color="C5D8EC"/>
               <w:start w:val="single" w:sz="4" w:space="0" w:color="C5D8EC"/>
@@ -10345,8 +10345,8 @@
       <w:u w:val="single"/>
     </w:rPr>
   </w:style>
-  <w:style w:type="character" w:styleId="FootnoteCharactersuser">
-    <w:name w:val="Footnote Characters (user)"/>
+  <w:style w:type="character" w:styleId="FootnoteCharacters">
+    <w:name w:val="Footnote Characters"/>
     <w:uiPriority w:val="99"/>
     <w:semiHidden/>
     <w:unhideWhenUsed/>
@@ -10355,8 +10355,8 @@
       <w:vertAlign w:val="superscript"/>
     </w:rPr>
   </w:style>
-  <w:style w:type="character" w:styleId="FootnoteCharacters">
-    <w:name w:val="Footnote Characters"/>
+  <w:style w:type="character" w:styleId="FootnoteCharactersuser">
+    <w:name w:val="Footnote Characters (user)"/>
     <w:qFormat/>
     <w:rPr>
       <w:vertAlign w:val="superscript"/>
@@ -10396,8 +10396,8 @@
       <w:iCs/>
     </w:rPr>
   </w:style>
-  <w:style w:type="character" w:styleId="Bullets">
-    <w:name w:val="Bullets"/>
+  <w:style w:type="character" w:styleId="Bulletsuser">
+    <w:name w:val="Bullets (user)"/>
     <w:qFormat/>
     <w:rPr>
       <w:rFonts w:ascii="OpenSymbol" w:hAnsi="OpenSymbol" w:eastAsia="OpenSymbol" w:cs="OpenSymbol"/>
@@ -10568,8 +10568,8 @@
     </w:pPr>
     <w:rPr/>
   </w:style>
-  <w:style w:type="paragraph" w:styleId="FrameContentsuser">
-    <w:name w:val="Frame Contents (user)"/>
+  <w:style w:type="paragraph" w:styleId="FrameContents">
+    <w:name w:val="Frame Contents"/>
     <w:basedOn w:val="Normal"/>
     <w:qFormat/>
     <w:pPr/>

</xml_diff>